<commit_message>
Upload via SKKN-AI: phu-luc-data_table.docx
</commit_message>
<xml_diff>
--- a/projects/skkn_1773776784610_eblasj47t/appendices/phu-luc-data_table.docx
+++ b/projects/skkn_1773776784610_eblasj47t/appendices/phu-luc-data_table.docx
@@ -1,53 +1,94 @@
 
-<file path=word/document.xml><?xml version="1.0" encoding="utf-8"?>
-<w:document xmlns:wpc="http://schemas.microsoft.com/office/word/2010/wordprocessingCanvas" xmlns:cx="http://schemas.microsoft.com/office/drawing/2014/chartex" xmlns:cx1="http://schemas.microsoft.com/office/drawing/2015/9/8/chartex" xmlns:cx2="http://schemas.microsoft.com/office/drawing/2015/10/21/chartex" xmlns:cx3="http://schemas.microsoft.com/office/drawing/2016/5/9/chartex" xmlns:cx4="http://schemas.microsoft.com/office/drawing/2016/5/10/chartex" xmlns:cx5="http://schemas.microsoft.com/office/drawing/2016/5/11/chartex" xmlns:cx6="http://schemas.microsoft.com/office/drawing/2016/5/12/chartex" xmlns:cx7="http://schemas.microsoft.com/office/drawing/2016/5/13/chartex" xmlns:cx8="http://schemas.microsoft.com/office/drawing/2016/5/14/chartex" xmlns:mc="http://schemas.openxmlformats.org/markup-compatibility/2006" xmlns:aink="http://schemas.microsoft.com/office/drawing/2016/ink" xmlns:am3d="http://schemas.microsoft.com/office/drawing/2017/model3d" xmlns:o="urn:schemas-microsoft-com:office:office" xmlns:oel="http://schemas.microsoft.com/office/2019/extlst" xmlns:r="http://schemas.openxmlformats.org/officeDocument/2006/relationships" xmlns:m="http://schemas.openxmlformats.org/officeDocument/2006/math" xmlns:v="urn:schemas-microsoft-com:vml" xmlns:wp14="http://schemas.microsoft.com/office/word/2010/wordprocessingDrawing" xmlns:wp="http://schemas.openxmlformats.org/drawingml/2006/wordprocessingDrawing" xmlns:w10="urn:schemas-microsoft-com:office:word" xmlns:w="http://schemas.openxmlformats.org/wordprocessingml/2006/main" xmlns:w14="http://schemas.microsoft.com/office/word/2010/wordml" xmlns:w15="http://schemas.microsoft.com/office/word/2012/wordml" xmlns:w16cex="http://schemas.microsoft.com/office/word/2018/wordml/cex" xmlns:w16cid="http://schemas.microsoft.com/office/word/2016/wordml/cid" xmlns:w16="http://schemas.microsoft.com/office/word/2018/wordml" xmlns:w16sdtdh="http://schemas.microsoft.com/office/word/2020/wordml/sdtdatahash" xmlns:w16se="http://schemas.microsoft.com/office/word/2015/wordml/symex" xmlns:wpg="http://schemas.microsoft.com/office/word/2010/wordprocessingGroup" xmlns:wpi="http://schemas.microsoft.com/office/word/2010/wordprocessingInk" xmlns:wne="http://schemas.microsoft.com/office/word/2006/wordml" xmlns:wps="http://schemas.microsoft.com/office/word/2010/wordprocessingShape" mc:Ignorable="w14 w15 w16se w16cid w16 w16cex w16sdtdh wp14">
-  <w:body>
-    <w:p>
-      <w:pPr>
-        <w:pageBreakBefore/>
-        <w:jc w:val="center"/>
-        <w:rPr>
-          <w:b/>
-          <w:bCs/>
-        </w:rPr>
-      </w:pPr>
-      <w:r>
-        <w:rPr>
-          <w:b/>
-          <w:bCs/>
-        </w:rPr>
-        <w:t>MINH CHỨNG PHỤ LỤC</w:t>
-      </w:r>
-    </w:p>
-    <w:p>
-      <w:pPr>
-        <w:spacing w:before="120" w:after="120"/>
-      </w:pPr>
-      <w:r>
-        <w:t>[NOI_DUNG_</w:t>
-      </w:r>
-      <w:r>
-        <w:t>PHU_LUC</w:t>
-      </w:r>
-      <w:r>
-        <w:t>]</w:t>
-      </w:r>
-    </w:p>
-    <w:sectPr>
-      <w:headerReference w:type="even" r:id="rId7"/>
-      <w:headerReference w:type="default" r:id="rId8"/>
-      <w:footerReference w:type="even" r:id="rId9"/>
-      <w:footerReference w:type="default" r:id="rId10"/>
-      <w:headerReference w:type="first" r:id="rId11"/>
-      <w:footerReference w:type="first" r:id="rId12"/>
-      <w:pgSz w:w="11906" w:h="16838"/>
-      <w:pgMar w:top="1134" w:right="1134" w:bottom="1134" w:left="1701" w:header="708" w:footer="708" w:gutter="0"/>
-      <w:pgNumType w:start="1"/>
-      <w:cols w:space="720"/>
-      <w:docGrid w:linePitch="360"/>
-    </w:sectPr>
-  </w:body>
-</w:document>
+<file path=word/document.xml><?xml version="1.0" encoding="UTF-8" standalone="yes"?>
+<w:document xmlns:wpc="http://schemas.microsoft.com/office/word/2010/wordprocessingCanvas" xmlns:cx="http://schemas.microsoft.com/office/drawing/2014/chartex" xmlns:cx1="http://schemas.microsoft.com/office/drawing/2015/9/8/chartex" xmlns:cx2="http://schemas.microsoft.com/office/drawing/2015/10/21/chartex" xmlns:cx3="http://schemas.microsoft.com/office/drawing/2016/5/9/chartex" xmlns:cx4="http://schemas.microsoft.com/office/drawing/2016/5/10/chartex" xmlns:cx5="http://schemas.microsoft.com/office/drawing/2016/5/11/chartex" xmlns:cx6="http://schemas.microsoft.com/office/drawing/2016/5/12/chartex" xmlns:cx7="http://schemas.microsoft.com/office/drawing/2016/5/13/chartex" xmlns:cx8="http://schemas.microsoft.com/office/drawing/2016/5/14/chartex" xmlns:mc="http://schemas.openxmlformats.org/markup-compatibility/2006" xmlns:aink="http://schemas.microsoft.com/office/drawing/2016/ink" xmlns:am3d="http://schemas.microsoft.com/office/drawing/2017/model3d" xmlns:o="urn:schemas-microsoft-com:office:office" xmlns:oel="http://schemas.microsoft.com/office/2019/extlst" xmlns:r="http://schemas.openxmlformats.org/officeDocument/2006/relationships" xmlns:m="http://schemas.openxmlformats.org/officeDocument/2006/math" xmlns:v="urn:schemas-microsoft-com:vml" xmlns:wp14="http://schemas.microsoft.com/office/word/2010/wordprocessingDrawing" xmlns:wp="http://schemas.openxmlformats.org/drawingml/2006/wordprocessingDrawing" xmlns:w10="urn:schemas-microsoft-com:office:word" xmlns:w="http://schemas.openxmlformats.org/wordprocessingml/2006/main" xmlns:w14="http://schemas.microsoft.com/office/word/2010/wordml" xmlns:w15="http://schemas.microsoft.com/office/word/2012/wordml" xmlns:w16cex="http://schemas.microsoft.com/office/word/2018/wordml/cex" xmlns:w16cid="http://schemas.microsoft.com/office/word/2016/wordml/cid" xmlns:w16="http://schemas.microsoft.com/office/word/2018/wordml" xmlns:w16sdtdh="http://schemas.microsoft.com/office/word/2020/wordml/sdtdatahash" xmlns:w16se="http://schemas.microsoft.com/office/word/2015/wordml/symex" xmlns:wpg="http://schemas.microsoft.com/office/word/2010/wordprocessingGroup" xmlns:wpi="http://schemas.microsoft.com/office/word/2010/wordprocessingInk" xmlns:wne="http://schemas.microsoft.com/office/word/2006/wordml" xmlns:wps="http://schemas.microsoft.com/office/word/2010/wordprocessingShape" mc:Ignorable="w14 w15 w16se w16cid w16 w16cex w16sdtdh wp14"><w:body><w:p><w:pPr><w:jc w:val="center"/></w:pPr><w:r><w:drawing><wp:inline cx="1524000" cy="1524000"><wp:extent cx="1524000" cy="1524000"/><wp:docPr id="999" name="QR"/><a:graphic xmlns:a="http://schemas.openxmlformats.org/drawingml/2006/main"><a:graphicData uri="http://schemas.openxmlformats.org/drawingml/2006/picture"><pic:pic xmlns:pic="http://schemas.openxmlformats.org/drawingml/2006/picture"><pic:nvPicPr><pic:cNvPr id="0" name="qr.png"/><pic:cNvPicPr/></pic:nvPicPr><pic:blipFill><a:blip xmlns:r="http://schemas.openxmlformats.org/officeDocument/2006/relationships" r:embed="rId999"/></a:blipFill><pic:spPr><a:xfrm><a:off x="0" y="0"/><a:ext cx="1524000" cy="1524000"/></a:xfrm><a:prstGeom prst="rect"><a:avLst/></a:prstGeom></pic:spPr></pic:pic></a:graphicData></a:graphic></wp:inline></w:drawing></w:r></w:p><w:p>
+<w:pPr>
+<w:jc w:val="both"/>
+<w:ind w:firstLine="720"/>
+<w:spacing w:line="360" w:lineRule="auto" w:after="120"/>
+</w:pPr>
+<w:r><w:t xml:space="preserve">Để minh chứng cho hiệu quả của giải pháp &quot;Ứng dụng công nghệ số trong mô hình hóa 3D nhằm nâng cao năng lực tưởng tượng không gian cho học sinh lớp 12 qua chủ đề phương pháp tọa độ trong không gian&quot;, tôi đã tiến hành khảo sát và đánh giá kết quả học tập của học sinh lớp thực nghiệm (12A2) và lớp đối chứng (12A1) tại Trường THPT PPPPTTTT trong năm học 2025-2026. Kết quả được tổng hợp và trình bày chi tiết qua các bảng thống kê dưới đây:</w:t></w:r>
+</w:p><w:p>
+<w:pPr>
+<w:jc w:val="both"/>
+<w:ind w:firstLine="720"/>
+<w:spacing w:line="360" w:lineRule="auto" w:after="120"/>
+</w:pPr>
+<w:r><w:rPr><w:b/></w:rPr><w:t xml:space="preserve">Bảng 1</w:t></w:r><w:r><w:rPr><w:b/></w:rPr><w:t xml:space="preserve">: Thống kê mô tả kết quả bài kiểm tra đánh giá năng lực tưởng tượng không gian và vận dụng kiến thức phương pháp tọa độ trong không gian</w:t></w:r>
+</w:p><w:tbl><w:tblPr><w:tblW w:w="9360" w:type="dxa"/><w:tblBorders><w:top w:val="single" w:sz="4" w:space="0" w:color="000000"/><w:left w:val="single" w:sz="4" w:space="0" w:color="000000"/><w:bottom w:val="single" w:sz="4" w:space="0" w:color="000000"/><w:right w:val="single" w:sz="4" w:space="0" w:color="000000"/><w:insideH w:val="single" w:sz="4" w:space="0" w:color="000000"/><w:insideV w:val="single" w:sz="4" w:space="0" w:color="000000"/></w:tblBorders><w:tblLook w:val="04A0"/></w:tblPr><w:tblGrid><w:gridCol w:w="1337"/><w:gridCol w:w="1337"/><w:gridCol w:w="1337"/><w:gridCol w:w="1337"/><w:gridCol w:w="1337"/><w:gridCol w:w="1337"/><w:gridCol w:w="1337"/></w:tblGrid><w:tr><w:tc><w:tcPr><w:tcW w:w="1337" w:type="dxa"/><w:shd w:val="clear" w:color="auto" w:fill="D5E8F0"/></w:tcPr><w:p><w:pPr><w:jc w:val="center"/></w:pPr><w:r><w:t xml:space="preserve">Chỉ số</w:t></w:r></w:p></w:tc><w:tc><w:tcPr><w:tcW w:w="1337" w:type="dxa"/><w:shd w:val="clear" w:color="auto" w:fill="D5E8F0"/></w:tcPr><w:p><w:pPr><w:jc w:val="center"/></w:pPr><w:r><w:t xml:space="preserve">Lớp</w:t></w:r></w:p></w:tc><w:tc><w:tcPr><w:tcW w:w="1337" w:type="dxa"/><w:shd w:val="clear" w:color="auto" w:fill="D5E8F0"/></w:tcPr><w:p><w:pPr><w:jc w:val="center"/></w:pPr><w:r><w:t xml:space="preserve">Số lượng HS</w:t></w:r></w:p></w:tc><w:tc><w:tcPr><w:tcW w:w="1337" w:type="dxa"/><w:shd w:val="clear" w:color="auto" w:fill="D5E8F0"/></w:tcPr><w:p><w:pPr><w:jc w:val="center"/></w:pPr><w:r><w:t xml:space="preserve">Điểm trung bình (ĐTB) trước tác động</w:t></w:r></w:p></w:tc><w:tc><w:tcPr><w:tcW w:w="1337" w:type="dxa"/><w:shd w:val="clear" w:color="auto" w:fill="D5E8F0"/></w:tcPr><w:p><w:pPr><w:jc w:val="center"/></w:pPr><w:r><w:t xml:space="preserve">Độ lệch chuẩn (ĐLC) trước tác động</w:t></w:r></w:p></w:tc><w:tc><w:tcPr><w:tcW w:w="1337" w:type="dxa"/><w:shd w:val="clear" w:color="auto" w:fill="D5E8F0"/></w:tcPr><w:p><w:pPr><w:jc w:val="center"/></w:pPr><w:r><w:t xml:space="preserve">Điểm trung bình (ĐTB) sau tác động</w:t></w:r></w:p></w:tc><w:tc><w:tcPr><w:tcW w:w="1337" w:type="dxa"/><w:shd w:val="clear" w:color="auto" w:fill="D5E8F0"/></w:tcPr><w:p><w:pPr><w:jc w:val="center"/></w:pPr><w:r><w:t xml:space="preserve">Độ lệch chuẩn (ĐLC) sau tác động</w:t></w:r></w:p></w:tc></w:tr><w:tr><w:tc><w:tcPr><w:tcW w:w="1337" w:type="dxa"/></w:tcPr><w:p><w:pPr><w:jc w:val="center"/></w:pPr><w:r><w:rPr><w:b/></w:rPr><w:t xml:space="preserve">Điểm kiểm tra (Thang 10)</w:t></w:r></w:p></w:tc><w:tc><w:tcPr><w:tcW w:w="1337" w:type="dxa"/></w:tcPr><w:p><w:pPr><w:jc w:val="center"/></w:pPr><w:r><w:rPr><w:b/></w:rPr><w:t xml:space="preserve">Đối chứng (12A1)</w:t></w:r></w:p></w:tc><w:tc><w:tcPr><w:tcW w:w="1337" w:type="dxa"/></w:tcPr><w:p><w:pPr><w:jc w:val="center"/></w:pPr><w:r><w:t xml:space="preserve">40</w:t></w:r></w:p></w:tc><w:tc><w:tcPr><w:tcW w:w="1337" w:type="dxa"/></w:tcPr><w:p><w:pPr><w:jc w:val="center"/></w:pPr><w:r><w:t xml:space="preserve">5.35</w:t></w:r></w:p></w:tc><w:tc><w:tcPr><w:tcW w:w="1337" w:type="dxa"/></w:tcPr><w:p><w:pPr><w:jc w:val="center"/></w:pPr><w:r><w:t xml:space="preserve">1.48</w:t></w:r></w:p></w:tc><w:tc><w:tcPr><w:tcW w:w="1337" w:type="dxa"/></w:tcPr><w:p><w:pPr><w:jc w:val="center"/></w:pPr><w:r><w:t xml:space="preserve">5.95</w:t></w:r></w:p></w:tc><w:tc><w:tcPr><w:tcW w:w="1337" w:type="dxa"/></w:tcPr><w:p><w:pPr><w:jc w:val="center"/></w:pPr><w:r><w:t xml:space="preserve">1.35</w:t></w:r></w:p></w:tc></w:tr><w:tr><w:tc><w:tcPr><w:tcW w:w="1337" w:type="dxa"/></w:tcPr><w:p><w:pPr><w:jc w:val="center"/></w:pPr><w:r><w:rPr><w:b/></w:rPr><w:t xml:space="preserve">Thực nghiệm (12A2)</w:t></w:r></w:p></w:tc><w:tc><w:tcPr><w:tcW w:w="1337" w:type="dxa"/></w:tcPr><w:p><w:pPr><w:jc w:val="center"/></w:pPr><w:r><w:t xml:space="preserve">40</w:t></w:r></w:p></w:tc><w:tc><w:tcPr><w:tcW w:w="1337" w:type="dxa"/></w:tcPr><w:p><w:pPr><w:jc w:val="center"/></w:pPr><w:r><w:t xml:space="preserve">5.42</w:t></w:r></w:p></w:tc><w:tc><w:tcPr><w:tcW w:w="1337" w:type="dxa"/></w:tcPr><w:p><w:pPr><w:jc w:val="center"/></w:pPr><w:r><w:t xml:space="preserve">1.45</w:t></w:r></w:p></w:tc><w:tc><w:tcPr><w:tcW w:w="1337" w:type="dxa"/></w:tcPr><w:p><w:pPr><w:jc w:val="center"/></w:pPr><w:r><w:t xml:space="preserve">7.40</w:t></w:r></w:p></w:tc><w:tc><w:tcPr><w:tcW w:w="1337" w:type="dxa"/></w:tcPr><w:p><w:pPr><w:jc w:val="center"/></w:pPr><w:r><w:t xml:space="preserve">1.10</w:t></w:r></w:p></w:tc><w:tc><w:tcPr><w:tcW w:w="1337" w:type="dxa"/></w:tcPr><w:p><w:pPr><w:jc w:val="center"/></w:pPr></w:p></w:tc></w:tr></w:tbl><w:p><w:pPr><w:spacing w:after="120"/></w:pPr></w:p><w:p><w:pPr>
+<w:jc w:val="both"/>
+<w:tabs><w:tab w:val="left" w:pos="720"/></w:tabs>
+<w:ind w:left="720" w:hanging="360"/>
+<w:spacing w:after="60"/>
+</w:pPr><w:r><w:t xml:space="preserve">• </w:t><w:tab/></w:r><w:r><w:rPr><w:b/></w:rPr><w:t xml:space="preserve">Nhận xét:</w:t></w:r></w:p><w:p><w:pPr>
+<w:jc w:val="both"/>
+<w:tabs><w:tab w:val="left" w:pos="720"/></w:tabs>
+<w:ind w:left="720" w:hanging="360"/>
+<w:spacing w:after="60"/>
+</w:pPr><w:r><w:t xml:space="preserve">• </w:t><w:tab/></w:r><w:r><w:t xml:space="preserve">Trước khi áp dụng giải pháp, điểm trung bình và độ lệch chuẩn của hai lớp Đối chứng và Thực nghiệm tương đương nhau, cho thấy năng lực tưởng tượng không gian và kiến thức nền tảng của học sinh hai lớp là tương đồng. Điều này đảm bảo tính khách quan trong việc so sánh hiệu quả của giải pháp.</w:t></w:r></w:p><w:p><w:pPr>
+<w:jc w:val="both"/>
+<w:tabs><w:tab w:val="left" w:pos="720"/></w:tabs>
+<w:ind w:left="720" w:hanging="360"/>
+<w:spacing w:after="60"/>
+</w:pPr><w:r><w:t xml:space="preserve">• </w:t><w:tab/></w:r><w:r><w:t xml:space="preserve">Sau khi áp dụng giải pháp, lớp Thực nghiệm (12A2) có sự cải thiện vượt bậc về điểm trung bình (từ 5.42 lên 7.40), cao hơn đáng kể so với lớp Đối chứng (từ 5.35 lên 5.95).</w:t></w:r></w:p><w:p><w:pPr>
+<w:jc w:val="both"/>
+<w:tabs><w:tab w:val="left" w:pos="720"/></w:tabs>
+<w:ind w:left="720" w:hanging="360"/>
+<w:spacing w:after="60"/>
+</w:pPr><w:r><w:t xml:space="preserve">• </w:t><w:tab/></w:r><w:r><w:t xml:space="preserve">Độ lệch chuẩn của lớp Thực nghiệm giảm rõ rệt (từ 1.45 xuống 1.10), cho thấy kết quả học tập của học sinh trong lớp đồng đều hơn, khoảng cách giữa học sinh khá giỏi và học sinh trung bình yếu được thu hẹp. Ngược lại, lớp Đối chứng có độ lệch chuẩn giảm ít hơn.</w:t></w:r></w:p><w:p>
+<w:pPr>
+<w:jc w:val="both"/>
+<w:ind w:firstLine="720"/>
+<w:spacing w:line="360" w:lineRule="auto" w:after="120"/>
+</w:pPr>
+<w:r><w:rPr><w:b/></w:rPr><w:t xml:space="preserve">Bảng 2</w:t></w:r><w:r><w:rPr><w:b/></w:rPr><w:t xml:space="preserve">: Phân loại học lực của học sinh theo kết quả bài kiểm tra</w:t></w:r>
+</w:p><w:tbl><w:tblPr><w:tblW w:w="9360" w:type="dxa"/><w:tblBorders><w:top w:val="single" w:sz="4" w:space="0" w:color="000000"/><w:left w:val="single" w:sz="4" w:space="0" w:color="000000"/><w:bottom w:val="single" w:sz="4" w:space="0" w:color="000000"/><w:right w:val="single" w:sz="4" w:space="0" w:color="000000"/><w:insideH w:val="single" w:sz="4" w:space="0" w:color="000000"/><w:insideV w:val="single" w:sz="4" w:space="0" w:color="000000"/></w:tblBorders><w:tblLook w:val="04A0"/></w:tblPr><w:tblGrid><w:gridCol w:w="1560"/><w:gridCol w:w="1560"/><w:gridCol w:w="1560"/><w:gridCol w:w="1560"/><w:gridCol w:w="1560"/><w:gridCol w:w="1560"/></w:tblGrid><w:tr><w:tc><w:tcPr><w:tcW w:w="1560" w:type="dxa"/><w:shd w:val="clear" w:color="auto" w:fill="D5E8F0"/></w:tcPr><w:p><w:pPr><w:jc w:val="center"/></w:pPr><w:r><w:t xml:space="preserve">Xếp loại học lực</w:t></w:r></w:p></w:tc><w:tc><w:tcPr><w:tcW w:w="1560" w:type="dxa"/><w:shd w:val="clear" w:color="auto" w:fill="D5E8F0"/></w:tcPr><w:p><w:pPr><w:jc w:val="center"/></w:pPr><w:r><w:t xml:space="preserve">Lớp</w:t></w:r></w:p></w:tc><w:tc><w:tcPr><w:tcW w:w="1560" w:type="dxa"/><w:shd w:val="clear" w:color="auto" w:fill="D5E8F0"/></w:tcPr><w:p><w:pPr><w:jc w:val="center"/></w:pPr><w:r><w:t xml:space="preserve">Số lượng HS trước tác động</w:t></w:r></w:p></w:tc><w:tc><w:tcPr><w:tcW w:w="1560" w:type="dxa"/><w:shd w:val="clear" w:color="auto" w:fill="D5E8F0"/></w:tcPr><w:p><w:pPr><w:jc w:val="center"/></w:pPr><w:r><w:t xml:space="preserve">Tỷ lệ (%) trước tác động</w:t></w:r></w:p></w:tc><w:tc><w:tcPr><w:tcW w:w="1560" w:type="dxa"/><w:shd w:val="clear" w:color="auto" w:fill="D5E8F0"/></w:tcPr><w:p><w:pPr><w:jc w:val="center"/></w:pPr><w:r><w:t xml:space="preserve">Số lượng HS sau tác động</w:t></w:r></w:p></w:tc><w:tc><w:tcPr><w:tcW w:w="1560" w:type="dxa"/><w:shd w:val="clear" w:color="auto" w:fill="D5E8F0"/></w:tcPr><w:p><w:pPr><w:jc w:val="center"/></w:pPr><w:r><w:t xml:space="preserve">Tỷ lệ (%) sau tác động</w:t></w:r></w:p></w:tc></w:tr><w:tr><w:tc><w:tcPr><w:tcW w:w="1560" w:type="dxa"/></w:tcPr><w:p><w:pPr><w:jc w:val="center"/></w:pPr><w:r><w:rPr><w:b/></w:rPr><w:t xml:space="preserve">Giỏi</w:t></w:r><w:r><w:t xml:space="preserve"> (Từ 8.0 trở lên)</w:t></w:r></w:p></w:tc><w:tc><w:tcPr><w:tcW w:w="1560" w:type="dxa"/></w:tcPr><w:p><w:pPr><w:jc w:val="center"/></w:pPr><w:r><w:rPr><w:b/></w:rPr><w:t xml:space="preserve">Đối chứng (12A1)</w:t></w:r></w:p></w:tc><w:tc><w:tcPr><w:tcW w:w="1560" w:type="dxa"/></w:tcPr><w:p><w:pPr><w:jc w:val="center"/></w:pPr><w:r><w:t xml:space="preserve">0</w:t></w:r></w:p></w:tc><w:tc><w:tcPr><w:tcW w:w="1560" w:type="dxa"/></w:tcPr><w:p><w:pPr><w:jc w:val="center"/></w:pPr><w:r><w:t xml:space="preserve">0.0%</w:t></w:r></w:p></w:tc><w:tc><w:tcPr><w:tcW w:w="1560" w:type="dxa"/></w:tcPr><w:p><w:pPr><w:jc w:val="center"/></w:pPr><w:r><w:t xml:space="preserve">3</w:t></w:r></w:p></w:tc><w:tc><w:tcPr><w:tcW w:w="1560" w:type="dxa"/></w:tcPr><w:p><w:pPr><w:jc w:val="center"/></w:pPr><w:r><w:t xml:space="preserve">7.5%</w:t></w:r></w:p></w:tc></w:tr><w:tr><w:tc><w:tcPr><w:tcW w:w="1560" w:type="dxa"/></w:tcPr><w:p><w:pPr><w:jc w:val="center"/></w:pPr><w:r><w:rPr><w:b/></w:rPr><w:t xml:space="preserve">Thực nghiệm (12A2)</w:t></w:r></w:p></w:tc><w:tc><w:tcPr><w:tcW w:w="1560" w:type="dxa"/></w:tcPr><w:p><w:pPr><w:jc w:val="center"/></w:pPr><w:r><w:t xml:space="preserve">0</w:t></w:r></w:p></w:tc><w:tc><w:tcPr><w:tcW w:w="1560" w:type="dxa"/></w:tcPr><w:p><w:pPr><w:jc w:val="center"/></w:pPr><w:r><w:t xml:space="preserve">0.0%</w:t></w:r></w:p></w:tc><w:tc><w:tcPr><w:tcW w:w="1560" w:type="dxa"/></w:tcPr><w:p><w:pPr><w:jc w:val="center"/></w:pPr><w:r><w:t xml:space="preserve">12</w:t></w:r></w:p></w:tc><w:tc><w:tcPr><w:tcW w:w="1560" w:type="dxa"/></w:tcPr><w:p><w:pPr><w:jc w:val="center"/></w:pPr><w:r><w:t xml:space="preserve">30.0%</w:t></w:r></w:p></w:tc><w:tc><w:tcPr><w:tcW w:w="1560" w:type="dxa"/></w:tcPr><w:p><w:pPr><w:jc w:val="center"/></w:pPr></w:p></w:tc></w:tr><w:tr><w:tc><w:tcPr><w:tcW w:w="1560" w:type="dxa"/></w:tcPr><w:p><w:pPr><w:jc w:val="center"/></w:pPr><w:r><w:rPr><w:b/></w:rPr><w:t xml:space="preserve">Khá</w:t></w:r><w:r><w:t xml:space="preserve"> (Từ 6.5 đến dưới 8.0)</w:t></w:r></w:p></w:tc><w:tc><w:tcPr><w:tcW w:w="1560" w:type="dxa"/></w:tcPr><w:p><w:pPr><w:jc w:val="center"/></w:pPr><w:r><w:rPr><w:b/></w:rPr><w:t xml:space="preserve">Đối chứng (12A1)</w:t></w:r></w:p></w:tc><w:tc><w:tcPr><w:tcW w:w="1560" w:type="dxa"/></w:tcPr><w:p><w:pPr><w:jc w:val="center"/></w:pPr><w:r><w:t xml:space="preserve">6</w:t></w:r></w:p></w:tc><w:tc><w:tcPr><w:tcW w:w="1560" w:type="dxa"/></w:tcPr><w:p><w:pPr><w:jc w:val="center"/></w:pPr><w:r><w:t xml:space="preserve">15.0%</w:t></w:r></w:p></w:tc><w:tc><w:tcPr><w:tcW w:w="1560" w:type="dxa"/></w:tcPr><w:p><w:pPr><w:jc w:val="center"/></w:pPr><w:r><w:t xml:space="preserve">10</w:t></w:r></w:p></w:tc><w:tc><w:tcPr><w:tcW w:w="1560" w:type="dxa"/></w:tcPr><w:p><w:pPr><w:jc w:val="center"/></w:pPr><w:r><w:t xml:space="preserve">25.0%</w:t></w:r></w:p></w:tc></w:tr><w:tr><w:tc><w:tcPr><w:tcW w:w="1560" w:type="dxa"/></w:tcPr><w:p><w:pPr><w:jc w:val="center"/></w:pPr><w:r><w:rPr><w:b/></w:rPr><w:t xml:space="preserve">Thực nghiệm (12A2)</w:t></w:r></w:p></w:tc><w:tc><w:tcPr><w:tcW w:w="1560" w:type="dxa"/></w:tcPr><w:p><w:pPr><w:jc w:val="center"/></w:pPr><w:r><w:t xml:space="preserve">7</w:t></w:r></w:p></w:tc><w:tc><w:tcPr><w:tcW w:w="1560" w:type="dxa"/></w:tcPr><w:p><w:pPr><w:jc w:val="center"/></w:pPr><w:r><w:t xml:space="preserve">17.5%</w:t></w:r></w:p></w:tc><w:tc><w:tcPr><w:tcW w:w="1560" w:type="dxa"/></w:tcPr><w:p><w:pPr><w:jc w:val="center"/></w:pPr><w:r><w:t xml:space="preserve">20</w:t></w:r></w:p></w:tc><w:tc><w:tcPr><w:tcW w:w="1560" w:type="dxa"/></w:tcPr><w:p><w:pPr><w:jc w:val="center"/></w:pPr><w:r><w:t xml:space="preserve">50.0%</w:t></w:r></w:p></w:tc><w:tc><w:tcPr><w:tcW w:w="1560" w:type="dxa"/></w:tcPr><w:p><w:pPr><w:jc w:val="center"/></w:pPr></w:p></w:tc></w:tr><w:tr><w:tc><w:tcPr><w:tcW w:w="1560" w:type="dxa"/></w:tcPr><w:p><w:pPr><w:jc w:val="center"/></w:pPr><w:r><w:rPr><w:b/></w:rPr><w:t xml:space="preserve">Trung bình</w:t></w:r><w:r><w:t xml:space="preserve"> (Từ 5.0 đến dưới 6.5)</w:t></w:r></w:p></w:tc><w:tc><w:tcPr><w:tcW w:w="1560" w:type="dxa"/></w:tcPr><w:p><w:pPr><w:jc w:val="center"/></w:pPr><w:r><w:rPr><w:b/></w:rPr><w:t xml:space="preserve">Đối chứng (12A1)</w:t></w:r></w:p></w:tc><w:tc><w:tcPr><w:tcW w:w="1560" w:type="dxa"/></w:tcPr><w:p><w:pPr><w:jc w:val="center"/></w:pPr><w:r><w:t xml:space="preserve">22</w:t></w:r></w:p></w:tc><w:tc><w:tcPr><w:tcW w:w="1560" w:type="dxa"/></w:tcPr><w:p><w:pPr><w:jc w:val="center"/></w:pPr><w:r><w:t xml:space="preserve">55.0%</w:t></w:r></w:p></w:tc><w:tc><w:tcPr><w:tcW w:w="1560" w:type="dxa"/></w:tcPr><w:p><w:pPr><w:jc w:val="center"/></w:pPr><w:r><w:t xml:space="preserve">19</w:t></w:r></w:p></w:tc><w:tc><w:tcPr><w:tcW w:w="1560" w:type="dxa"/></w:tcPr><w:p><w:pPr><w:jc w:val="center"/></w:pPr><w:r><w:t xml:space="preserve">47.5%</w:t></w:r></w:p></w:tc></w:tr><w:tr><w:tc><w:tcPr><w:tcW w:w="1560" w:type="dxa"/></w:tcPr><w:p><w:pPr><w:jc w:val="center"/></w:pPr><w:r><w:rPr><w:b/></w:rPr><w:t xml:space="preserve">Thực nghiệm (12A2)</w:t></w:r></w:p></w:tc><w:tc><w:tcPr><w:tcW w:w="1560" w:type="dxa"/></w:tcPr><w:p><w:pPr><w:jc w:val="center"/></w:pPr><w:r><w:t xml:space="preserve">21</w:t></w:r></w:p></w:tc><w:tc><w:tcPr><w:tcW w:w="1560" w:type="dxa"/></w:tcPr><w:p><w:pPr><w:jc w:val="center"/></w:pPr><w:r><w:t xml:space="preserve">52.5%</w:t></w:r></w:p></w:tc><w:tc><w:tcPr><w:tcW w:w="1560" w:type="dxa"/></w:tcPr><w:p><w:pPr><w:jc w:val="center"/></w:pPr><w:r><w:t xml:space="preserve">8</w:t></w:r></w:p></w:tc><w:tc><w:tcPr><w:tcW w:w="1560" w:type="dxa"/></w:tcPr><w:p><w:pPr><w:jc w:val="center"/></w:pPr><w:r><w:t xml:space="preserve">20.0%</w:t></w:r></w:p></w:tc><w:tc><w:tcPr><w:tcW w:w="1560" w:type="dxa"/></w:tcPr><w:p><w:pPr><w:jc w:val="center"/></w:pPr></w:p></w:tc></w:tr><w:tr><w:tc><w:tcPr><w:tcW w:w="1560" w:type="dxa"/></w:tcPr><w:p><w:pPr><w:jc w:val="center"/></w:pPr><w:r><w:rPr><w:b/></w:rPr><w:t xml:space="preserve">Yếu</w:t></w:r><w:r><w:t xml:space="preserve"> (Dưới 5.0)</w:t></w:r></w:p></w:tc><w:tc><w:tcPr><w:tcW w:w="1560" w:type="dxa"/></w:tcPr><w:p><w:pPr><w:jc w:val="center"/></w:pPr><w:r><w:rPr><w:b/></w:rPr><w:t xml:space="preserve">Đối chứng (12A1)</w:t></w:r></w:p></w:tc><w:tc><w:tcPr><w:tcW w:w="1560" w:type="dxa"/></w:tcPr><w:p><w:pPr><w:jc w:val="center"/></w:pPr><w:r><w:t xml:space="preserve">12</w:t></w:r></w:p></w:tc><w:tc><w:tcPr><w:tcW w:w="1560" w:type="dxa"/></w:tcPr><w:p><w:pPr><w:jc w:val="center"/></w:pPr><w:r><w:t xml:space="preserve">30.0%</w:t></w:r></w:p></w:tc><w:tc><w:tcPr><w:tcW w:w="1560" w:type="dxa"/></w:tcPr><w:p><w:pPr><w:jc w:val="center"/></w:pPr><w:r><w:t xml:space="preserve">8</w:t></w:r></w:p></w:tc><w:tc><w:tcPr><w:tcW w:w="1560" w:type="dxa"/></w:tcPr><w:p><w:pPr><w:jc w:val="center"/></w:pPr><w:r><w:t xml:space="preserve">20.0%</w:t></w:r></w:p></w:tc></w:tr><w:tr><w:tc><w:tcPr><w:tcW w:w="1560" w:type="dxa"/></w:tcPr><w:p><w:pPr><w:jc w:val="center"/></w:pPr><w:r><w:rPr><w:b/></w:rPr><w:t xml:space="preserve">Thực nghiệm (12A2)</w:t></w:r></w:p></w:tc><w:tc><w:tcPr><w:tcW w:w="1560" w:type="dxa"/></w:tcPr><w:p><w:pPr><w:jc w:val="center"/></w:pPr><w:r><w:t xml:space="preserve">12</w:t></w:r></w:p></w:tc><w:tc><w:tcPr><w:tcW w:w="1560" w:type="dxa"/></w:tcPr><w:p><w:pPr><w:jc w:val="center"/></w:pPr><w:r><w:t xml:space="preserve">30.0%</w:t></w:r></w:p></w:tc><w:tc><w:tcPr><w:tcW w:w="1560" w:type="dxa"/></w:tcPr><w:p><w:pPr><w:jc w:val="center"/></w:pPr><w:r><w:t xml:space="preserve">0</w:t></w:r></w:p></w:tc><w:tc><w:tcPr><w:tcW w:w="1560" w:type="dxa"/></w:tcPr><w:p><w:pPr><w:jc w:val="center"/></w:pPr><w:r><w:t xml:space="preserve">0.0%</w:t></w:r></w:p></w:tc><w:tc><w:tcPr><w:tcW w:w="1560" w:type="dxa"/></w:tcPr><w:p><w:pPr><w:jc w:val="center"/></w:pPr></w:p></w:tc></w:tr><w:tr><w:tc><w:tcPr><w:tcW w:w="1560" w:type="dxa"/></w:tcPr><w:p><w:pPr><w:jc w:val="center"/></w:pPr><w:r><w:rPr><w:b/></w:rPr><w:t xml:space="preserve">Tổng cộng</w:t></w:r></w:p></w:tc><w:tc><w:tcPr><w:tcW w:w="1560" w:type="dxa"/></w:tcPr><w:p><w:pPr><w:jc w:val="center"/></w:pPr><w:r><w:rPr><w:b/></w:rPr><w:t xml:space="preserve">80</w:t></w:r></w:p></w:tc><w:tc><w:tcPr><w:tcW w:w="1560" w:type="dxa"/></w:tcPr><w:p><w:pPr><w:jc w:val="center"/></w:pPr><w:r><w:rPr><w:b/></w:rPr><w:t xml:space="preserve">100%</w:t></w:r></w:p></w:tc><w:tc><w:tcPr><w:tcW w:w="1560" w:type="dxa"/></w:tcPr><w:p><w:pPr><w:jc w:val="center"/></w:pPr><w:r><w:rPr><w:b/></w:rPr><w:t xml:space="preserve">80</w:t></w:r></w:p></w:tc><w:tc><w:tcPr><w:tcW w:w="1560" w:type="dxa"/></w:tcPr><w:p><w:pPr><w:jc w:val="center"/></w:pPr><w:r><w:rPr><w:b/></w:rPr><w:t xml:space="preserve">100%</w:t></w:r></w:p></w:tc><w:tc><w:tcPr><w:tcW w:w="1560" w:type="dxa"/></w:tcPr><w:p><w:pPr><w:jc w:val="center"/></w:pPr></w:p></w:tc></w:tr></w:tbl><w:p><w:pPr><w:spacing w:after="120"/></w:pPr></w:p><w:p><w:pPr>
+<w:jc w:val="both"/>
+<w:tabs><w:tab w:val="left" w:pos="720"/></w:tabs>
+<w:ind w:left="720" w:hanging="360"/>
+<w:spacing w:after="60"/>
+</w:pPr><w:r><w:t xml:space="preserve">• </w:t><w:tab/></w:r><w:r><w:rPr><w:b/></w:rPr><w:t xml:space="preserve">Nhận xét:</w:t></w:r></w:p><w:p><w:pPr>
+<w:jc w:val="both"/>
+<w:tabs><w:tab w:val="left" w:pos="720"/></w:tabs>
+<w:ind w:left="720" w:hanging="360"/>
+<w:spacing w:after="60"/>
+</w:pPr><w:r><w:t xml:space="preserve">• </w:t><w:tab/></w:r><w:r><w:t xml:space="preserve">Trước tác động, cả hai lớp đều có tỷ lệ học sinh yếu và trung bình cao (tổng cộng trên 80%), không có học sinh đạt loại Giỏi, phản ánh đúng thực trạng &quot;học sinh yếu năng lực tưởng tượng không gian&quot; và &quot;kết quả kiểm tra thấp&quot;.</w:t></w:r></w:p><w:p><w:pPr>
+<w:jc w:val="both"/>
+<w:tabs><w:tab w:val="left" w:pos="720"/></w:tabs>
+<w:ind w:left="720" w:hanging="360"/>
+<w:spacing w:after="60"/>
+</w:pPr><w:r><w:t xml:space="preserve">• </w:t><w:tab/></w:r><w:r><w:t xml:space="preserve">Sau tác động, sự thay đổi về học lực của lớp Thực nghiệm (12A2) là rất rõ rệt và tích cực:</w:t></w:r></w:p><w:p><w:pPr>
+<w:jc w:val="both"/>
+<w:tabs><w:tab w:val="left" w:pos="720"/></w:tabs>
+<w:ind w:left="720" w:hanging="360"/>
+<w:spacing w:after="60"/>
+</w:pPr><w:r><w:t xml:space="preserve">• </w:t><w:tab/></w:r><w:r><w:t xml:space="preserve">Tỷ lệ học sinh đạt loại Giỏi tăng từ 0% lên 30.0% (12 học sinh).</w:t></w:r></w:p><w:p><w:pPr>
+<w:jc w:val="both"/>
+<w:tabs><w:tab w:val="left" w:pos="720"/></w:tabs>
+<w:ind w:left="720" w:hanging="360"/>
+<w:spacing w:after="60"/>
+</w:pPr><w:r><w:t xml:space="preserve">• </w:t><w:tab/></w:r><w:r><w:t xml:space="preserve">Tỷ lệ học sinh đạt loại Khá tăng từ 17.5% lên 50.0% (20 học sinh).</w:t></w:r></w:p><w:p><w:pPr>
+<w:jc w:val="both"/>
+<w:tabs><w:tab w:val="left" w:pos="720"/></w:tabs>
+<w:ind w:left="720" w:hanging="360"/>
+<w:spacing w:after="60"/>
+</w:pPr><w:r><w:t xml:space="preserve">• </w:t><w:tab/></w:r><w:r><w:t xml:space="preserve">Tổng số học sinh đạt loại Khá và Giỏi của lớp Thực nghiệm là 80.0% (32 học sinh), vượt mục tiêu đề ra (ít nhất 70% học sinh đạt điểm từ 7 trở lên).</w:t></w:r></w:p><w:p><w:pPr>
+<w:jc w:val="both"/>
+<w:tabs><w:tab w:val="left" w:pos="720"/></w:tabs>
+<w:ind w:left="720" w:hanging="360"/>
+<w:spacing w:after="60"/>
+</w:pPr><w:r><w:t xml:space="preserve">• </w:t><w:tab/></w:r><w:r><w:t xml:space="preserve">Đặc biệt, tỷ lệ học sinh yếu giảm từ 30.0% xuống 0%, cho thấy giải pháp đã giúp khắc phục hoàn toàn tình trạng học sinh yếu kém trong chủ đề này.</w:t></w:r></w:p><w:p><w:pPr>
+<w:jc w:val="both"/>
+<w:tabs><w:tab w:val="left" w:pos="720"/></w:tabs>
+<w:ind w:left="720" w:hanging="360"/>
+<w:spacing w:after="60"/>
+</w:pPr><w:r><w:t xml:space="preserve">• </w:t><w:tab/></w:r><w:r><w:t xml:space="preserve">Trong khi đó, lớp Đối chứng (12A1) cũng có sự cải thiện nhưng ở mức độ khiêm tốn hơn: tỷ lệ học sinh Giỏi và Khá tăng nhẹ (tổng cộng 32.5%), tỷ lệ học sinh Yếu giảm nhưng vẫn còn 20.0%.</w:t></w:r></w:p><w:p>
+<w:pPr>
+<w:jc w:val="both"/>
+<w:ind w:firstLine="720"/>
+<w:spacing w:line="360" w:lineRule="auto" w:after="120"/>
+</w:pPr>
+<w:r><w:t xml:space="preserve">Những số liệu trên đã minh chứng một cách khách quan và khoa học về tính hiệu quả của việc ứng dụng công nghệ số trong mô hình hóa 3D để nâng cao năng lực tưởng tượng không gian và chất lượng học tập môn Toán cho học sinh lớp 12 tại Trường THPT PPPPTTTT.</w:t></w:r>
+</w:p><w:sectPr><w:headerReference w:type="even" r:id="rId7"/><w:headerReference w:type="default" r:id="rId8"/><w:footerReference w:type="even" r:id="rId9"/><w:footerReference w:type="default" r:id="rId10"/><w:headerReference w:type="first" r:id="rId11"/><w:footerReference w:type="first" r:id="rId12"/><w:pgSz w:w="11906" w:h="16838"/><w:pgMar w:top="1134" w:right="1134" w:bottom="1134" w:left="1701" w:header="708" w:footer="708" w:gutter="0"/><w:pgNumType w:start="1"/><w:cols w:space="720"/><w:docGrid w:linePitch="360"/></w:sectPr></w:body></w:document>
 </file>
 
 <file path=word/endnotes.xml><?xml version="1.0" encoding="utf-8"?>

</xml_diff>